<commit_message>
Mudei o navegador para CHROME
</commit_message>
<xml_diff>
--- a/Documentacao_Tecnica.docx
+++ b/Documentacao_Tecnica.docx
@@ -1,6 +1,6 @@
 
 <file path=word/document.xml><?xml version="1.0" encoding="utf-8"?>
-<w:document xmlns:wpc="http://schemas.microsoft.com/office/word/2010/wordprocessingCanvas" xmlns:cx="http://schemas.microsoft.com/office/drawing/2014/chartex" xmlns:cx1="http://schemas.microsoft.com/office/drawing/2015/9/8/chartex" xmlns:cx2="http://schemas.microsoft.com/office/drawing/2015/10/21/chartex" xmlns:cx3="http://schemas.microsoft.com/office/drawing/2016/5/9/chartex" xmlns:cx4="http://schemas.microsoft.com/office/drawing/2016/5/10/chartex" xmlns:cx5="http://schemas.microsoft.com/office/drawing/2016/5/11/chartex" xmlns:cx6="http://schemas.microsoft.com/office/drawing/2016/5/12/chartex" xmlns:cx7="http://schemas.microsoft.com/office/drawing/2016/5/13/chartex" xmlns:cx8="http://schemas.microsoft.com/office/drawing/2016/5/14/chartex" xmlns:mc="http://schemas.openxmlformats.org/markup-compatibility/2006" xmlns:aink="http://schemas.microsoft.com/office/drawing/2016/ink" xmlns:am3d="http://schemas.microsoft.com/office/drawing/2017/model3d" xmlns:o="urn:schemas-microsoft-com:office:office" xmlns:r="http://schemas.openxmlformats.org/officeDocument/2006/relationships" xmlns:m="http://schemas.openxmlformats.org/officeDocument/2006/math" xmlns:v="urn:schemas-microsoft-com:vml" xmlns:wp14="http://schemas.microsoft.com/office/word/2010/wordprocessingDrawing" xmlns:wp="http://schemas.openxmlformats.org/drawingml/2006/wordprocessingDrawing" xmlns:w10="urn:schemas-microsoft-com:office:word" xmlns:w="http://schemas.openxmlformats.org/wordprocessingml/2006/main" xmlns:w14="http://schemas.microsoft.com/office/word/2010/wordml" xmlns:w15="http://schemas.microsoft.com/office/word/2012/wordml" xmlns:w16cex="http://schemas.microsoft.com/office/word/2018/wordml/cex" xmlns:w16cid="http://schemas.microsoft.com/office/word/2016/wordml/cid" xmlns:w16="http://schemas.microsoft.com/office/word/2018/wordml" xmlns:w16sdtdh="http://schemas.microsoft.com/office/word/2020/wordml/sdtdatahash" xmlns:w16se="http://schemas.microsoft.com/office/word/2015/wordml/symex" xmlns:wpg="http://schemas.microsoft.com/office/word/2010/wordprocessingGroup" xmlns:wpi="http://schemas.microsoft.com/office/word/2010/wordprocessingInk" xmlns:wne="http://schemas.microsoft.com/office/word/2006/wordml" xmlns:wps="http://schemas.microsoft.com/office/word/2010/wordprocessingShape" mc:Ignorable="w14 w15 w16se w16cid w16 w16cex w16sdtdh wp14">
+<w:document xmlns:wpc="http://schemas.microsoft.com/office/word/2010/wordprocessingCanvas" xmlns:cx="http://schemas.microsoft.com/office/drawing/2014/chartex" xmlns:cx1="http://schemas.microsoft.com/office/drawing/2015/9/8/chartex" xmlns:cx2="http://schemas.microsoft.com/office/drawing/2015/10/21/chartex" xmlns:cx3="http://schemas.microsoft.com/office/drawing/2016/5/9/chartex" xmlns:cx4="http://schemas.microsoft.com/office/drawing/2016/5/10/chartex" xmlns:cx5="http://schemas.microsoft.com/office/drawing/2016/5/11/chartex" xmlns:cx6="http://schemas.microsoft.com/office/drawing/2016/5/12/chartex" xmlns:cx7="http://schemas.microsoft.com/office/drawing/2016/5/13/chartex" xmlns:cx8="http://schemas.microsoft.com/office/drawing/2016/5/14/chartex" xmlns:mc="http://schemas.openxmlformats.org/markup-compatibility/2006" xmlns:aink="http://schemas.microsoft.com/office/drawing/2016/ink" xmlns:am3d="http://schemas.microsoft.com/office/drawing/2017/model3d" xmlns:o="urn:schemas-microsoft-com:office:office" xmlns:oel="http://schemas.microsoft.com/office/2019/extlst" xmlns:r="http://schemas.openxmlformats.org/officeDocument/2006/relationships" xmlns:m="http://schemas.openxmlformats.org/officeDocument/2006/math" xmlns:v="urn:schemas-microsoft-com:vml" xmlns:wp14="http://schemas.microsoft.com/office/word/2010/wordprocessingDrawing" xmlns:wp="http://schemas.openxmlformats.org/drawingml/2006/wordprocessingDrawing" xmlns:w10="urn:schemas-microsoft-com:office:word" xmlns:w="http://schemas.openxmlformats.org/wordprocessingml/2006/main" xmlns:w14="http://schemas.microsoft.com/office/word/2010/wordml" xmlns:w15="http://schemas.microsoft.com/office/word/2012/wordml" xmlns:w16cex="http://schemas.microsoft.com/office/word/2018/wordml/cex" xmlns:w16cid="http://schemas.microsoft.com/office/word/2016/wordml/cid" xmlns:w16="http://schemas.microsoft.com/office/word/2018/wordml" xmlns:w16du="http://schemas.microsoft.com/office/word/2023/wordml/word16du" xmlns:w16sdtdh="http://schemas.microsoft.com/office/word/2020/wordml/sdtdatahash" xmlns:w16sdtfl="http://schemas.microsoft.com/office/word/2024/wordml/sdtformatlock" xmlns:w16se="http://schemas.microsoft.com/office/word/2015/wordml/symex" xmlns:wpg="http://schemas.microsoft.com/office/word/2010/wordprocessingGroup" xmlns:wpi="http://schemas.microsoft.com/office/word/2010/wordprocessingInk" xmlns:wne="http://schemas.microsoft.com/office/word/2006/wordml" xmlns:wps="http://schemas.microsoft.com/office/word/2010/wordprocessingShape" mc:Ignorable="w14 w15 w16se w16cid w16 w16cex w16sdtdh w16sdtfl w16du wp14">
   <w:body>
     <w:p>
       <w:pPr>
@@ -270,21 +270,7 @@
           <w:rFonts w:ascii="Arial" w:hAnsi="Arial" w:cs="Arial"/>
           <w:lang w:val="pt-BR"/>
         </w:rPr>
-        <w:t>O sistema "Status de Comunicação" é uma solução</w:t>
-      </w:r>
-      <w:r>
-        <w:rPr>
-          <w:rFonts w:ascii="Arial" w:hAnsi="Arial" w:cs="Arial"/>
-          <w:lang w:val="pt-BR"/>
-        </w:rPr>
-        <w:t xml:space="preserve"> desenvolvida para orquestrar a atualização dos dados de telemetria de ativos. O objetivo primário é garantir a integridade da informação "Última Comunicação" na base de dados mestra (Excel), mitigando erros humanos e reduzindo o tempo operacion</w:t>
-      </w:r>
-      <w:r>
-        <w:rPr>
-          <w:rFonts w:ascii="Arial" w:hAnsi="Arial" w:cs="Arial"/>
-          <w:lang w:val="pt-BR"/>
-        </w:rPr>
-        <w:t>al.</w:t>
+        <w:t>O sistema "Status de Comunicação" é uma solução desenvolvida para orquestrar a atualização dos dados de telemetria de ativos. O objetivo primário é garantir a integridade da informação "Última Comunicação" na base de dados mestra (Excel), mitigando erros humanos e reduzindo o tempo operacional.</w:t>
       </w:r>
     </w:p>
     <w:p>
@@ -315,23 +301,7 @@
           <w:rFonts w:ascii="Arial" w:hAnsi="Arial" w:cs="Arial"/>
           <w:lang w:val="pt-BR"/>
         </w:rPr>
-        <w:t xml:space="preserve">A solução opera sob uma arquitetura modular baseada em </w:t>
-      </w:r>
-      <w:proofErr w:type="spellStart"/>
-      <w:r>
-        <w:rPr>
-          <w:rFonts w:ascii="Arial" w:hAnsi="Arial" w:cs="Arial"/>
-          <w:lang w:val="pt-BR"/>
-        </w:rPr>
-        <w:t>microsserviços</w:t>
-      </w:r>
-      <w:proofErr w:type="spellEnd"/>
-      <w:r>
-        <w:rPr>
-          <w:rFonts w:ascii="Arial" w:hAnsi="Arial" w:cs="Arial"/>
-          <w:lang w:val="pt-BR"/>
-        </w:rPr>
-        <w:t xml:space="preserve">, onde um orquestrador central </w:t>
+        <w:t xml:space="preserve">A solução opera sob uma arquitetura modular baseada em microsserviços, onde um orquestrador central </w:t>
       </w:r>
       <w:r>
         <w:rPr>
@@ -378,14 +348,7 @@
           <w:rFonts w:ascii="Arial" w:hAnsi="Arial" w:cs="Arial"/>
           <w:lang w:val="pt-BR"/>
         </w:rPr>
-        <w:t>2</w:t>
-      </w:r>
-      <w:r>
-        <w:rPr>
-          <w:rFonts w:ascii="Arial" w:hAnsi="Arial" w:cs="Arial"/>
-          <w:lang w:val="pt-BR"/>
-        </w:rPr>
-        <w:t>. Coleta (</w:t>
+        <w:t>2. Coleta (</w:t>
       </w:r>
       <w:proofErr w:type="spellStart"/>
       <w:r>
@@ -520,12 +483,6 @@
           <w:lang w:val="pt-BR"/>
         </w:rPr>
         <w:br/>
-      </w:r>
-      <w:r>
-        <w:rPr>
-          <w:rFonts w:ascii="Arial" w:hAnsi="Arial" w:cs="Arial"/>
-          <w:lang w:val="pt-BR"/>
-        </w:rPr>
         <w:t>│</w:t>
       </w:r>
       <w:r>
@@ -599,14 +556,7 @@
           <w:rFonts w:ascii="Arial" w:hAnsi="Arial" w:cs="Arial"/>
           <w:lang w:val="pt-BR"/>
         </w:rPr>
-        <w:t>] Autom</w:t>
-      </w:r>
-      <w:r>
-        <w:rPr>
-          <w:rFonts w:ascii="Arial" w:hAnsi="Arial" w:cs="Arial"/>
-          <w:lang w:val="pt-BR"/>
-        </w:rPr>
-        <w:t>ação do Portal DSP</w:t>
+        <w:t>] Automação do Portal DSP</w:t>
       </w:r>
       <w:r>
         <w:rPr>
@@ -670,14 +620,7 @@
           <w:lang w:val="pt-BR"/>
         </w:rPr>
         <w:br/>
-        <w:t>└── msedgedriver.exe            # Driv</w:t>
-      </w:r>
-      <w:r>
-        <w:rPr>
-          <w:rFonts w:ascii="Arial" w:hAnsi="Arial" w:cs="Arial"/>
-          <w:lang w:val="pt-BR"/>
-        </w:rPr>
-        <w:t>er do navegador</w:t>
+        <w:t>└── msedgedriver.exe            # Driver do navegador</w:t>
       </w:r>
     </w:p>
     <w:p>
@@ -1171,13 +1114,7 @@
               <w:rPr>
                 <w:rFonts w:ascii="Arial" w:hAnsi="Arial" w:cs="Arial"/>
               </w:rPr>
-              <w:t xml:space="preserve">Diretório </w:t>
-            </w:r>
-            <w:r>
-              <w:rPr>
-                <w:rFonts w:ascii="Arial" w:hAnsi="Arial" w:cs="Arial"/>
-              </w:rPr>
-              <w:t>temporário para processamento</w:t>
+              <w:t>Diretório temporário para processamento</w:t>
             </w:r>
           </w:p>
         </w:tc>
@@ -1392,14 +1329,7 @@
           <w:rFonts w:ascii="Arial" w:hAnsi="Arial" w:cs="Arial"/>
           <w:lang w:val="pt-BR"/>
         </w:rPr>
-        <w:t xml:space="preserve">4. </w:t>
-      </w:r>
-      <w:r>
-        <w:rPr>
-          <w:rFonts w:ascii="Arial" w:hAnsi="Arial" w:cs="Arial"/>
-          <w:lang w:val="pt-BR"/>
-        </w:rPr>
-        <w:t>Detalhamento Técnico dos Módulos</w:t>
+        <w:t>4. Detalhamento Técnico dos Módulos</w:t>
       </w:r>
     </w:p>
     <w:p>
@@ -1513,7 +1443,16 @@
           <w:b/>
           <w:lang w:val="pt-BR"/>
         </w:rPr>
-        <w:t>gerenciar_edgedriver</w:t>
+        <w:t>gerenciar_</w:t>
+      </w:r>
+      <w:proofErr w:type="gramStart"/>
+      <w:r>
+        <w:rPr>
+          <w:rFonts w:ascii="Arial" w:hAnsi="Arial" w:cs="Arial"/>
+          <w:b/>
+          <w:lang w:val="pt-BR"/>
+        </w:rPr>
+        <w:t>edgedriver</w:t>
       </w:r>
       <w:proofErr w:type="spellEnd"/>
       <w:r>
@@ -1522,7 +1461,16 @@
           <w:b/>
           <w:lang w:val="pt-BR"/>
         </w:rPr>
-        <w:t xml:space="preserve">(): </w:t>
+        <w:t>(</w:t>
+      </w:r>
+      <w:proofErr w:type="gramEnd"/>
+      <w:r>
+        <w:rPr>
+          <w:rFonts w:ascii="Arial" w:hAnsi="Arial" w:cs="Arial"/>
+          <w:b/>
+          <w:lang w:val="pt-BR"/>
+        </w:rPr>
+        <w:t xml:space="preserve">): </w:t>
       </w:r>
       <w:r>
         <w:rPr>
@@ -1640,30 +1588,7 @@
           <w:rFonts w:ascii="Arial" w:hAnsi="Arial" w:cs="Arial"/>
           <w:lang w:val="pt-BR"/>
         </w:rPr>
-        <w:t>/</w:t>
-      </w:r>
-      <w:proofErr w:type="spellStart"/>
-      <w:r>
-        <w:rPr>
-          <w:rFonts w:ascii="Arial" w:hAnsi="Arial" w:cs="Arial"/>
-          <w:lang w:val="pt-BR"/>
-        </w:rPr>
-        <w:t>Fleet</w:t>
-      </w:r>
-      <w:proofErr w:type="spellEnd"/>
-      <w:r>
-        <w:rPr>
-          <w:rFonts w:ascii="Arial" w:hAnsi="Arial" w:cs="Arial"/>
-          <w:lang w:val="pt-BR"/>
-        </w:rPr>
-        <w:t xml:space="preserve"> </w:t>
-      </w:r>
-      <w:r>
-        <w:rPr>
-          <w:rFonts w:ascii="Arial" w:hAnsi="Arial" w:cs="Arial"/>
-          <w:lang w:val="pt-BR"/>
-        </w:rPr>
-        <w:t>Status".</w:t>
+        <w:t>/Fleet Status".</w:t>
       </w:r>
     </w:p>
     <w:p>
@@ -1725,14 +1650,7 @@
           <w:rFonts w:ascii="Arial" w:hAnsi="Arial" w:cs="Arial"/>
           <w:lang w:val="pt-BR"/>
         </w:rPr>
-        <w:t>Acionado para exce</w:t>
-      </w:r>
-      <w:r>
-        <w:rPr>
-          <w:rFonts w:ascii="Arial" w:hAnsi="Arial" w:cs="Arial"/>
-          <w:lang w:val="pt-BR"/>
-        </w:rPr>
-        <w:t>ções. Busca pontual (Item a Item) para preencher lacunas.</w:t>
+        <w:t>Acionado para exceções. Busca pontual (Item a Item) para preencher lacunas.</w:t>
       </w:r>
     </w:p>
     <w:p>
@@ -1808,21 +1726,21 @@
         <w:rPr>
           <w:rFonts w:ascii="Arial" w:hAnsi="Arial" w:cs="Arial"/>
         </w:rPr>
-        <w:t xml:space="preserve">• </w:t>
+        <w:t xml:space="preserve">Falha de </w:t>
       </w:r>
-      <w:proofErr w:type="spellStart"/>
+      <w:proofErr w:type="gramStart"/>
       <w:r>
         <w:rPr>
           <w:rFonts w:ascii="Arial" w:hAnsi="Arial" w:cs="Arial"/>
         </w:rPr>
-        <w:t>Falha</w:t>
+        <w:t>Download do</w:t>
       </w:r>
-      <w:proofErr w:type="spellEnd"/>
+      <w:proofErr w:type="gramEnd"/>
       <w:r>
         <w:rPr>
           <w:rFonts w:ascii="Arial" w:hAnsi="Arial" w:cs="Arial"/>
         </w:rPr>
-        <w:t xml:space="preserve"> de Download do Driver.</w:t>
+        <w:t xml:space="preserve"> Driver.</w:t>
       </w:r>
     </w:p>
     <w:p>
@@ -1838,14 +1756,7 @@
           <w:rFonts w:ascii="Arial" w:hAnsi="Arial" w:cs="Arial"/>
           <w:lang w:val="pt-BR"/>
         </w:rPr>
-        <w:t>• Elementos Web não</w:t>
-      </w:r>
-      <w:r>
-        <w:rPr>
-          <w:rFonts w:ascii="Arial" w:hAnsi="Arial" w:cs="Arial"/>
-          <w:lang w:val="pt-BR"/>
-        </w:rPr>
-        <w:t xml:space="preserve"> encontrados (</w:t>
+        <w:t>Elementos Web não encontrados (</w:t>
       </w:r>
       <w:proofErr w:type="spellStart"/>
       <w:r>
@@ -1877,7 +1788,7 @@
           <w:rFonts w:ascii="Arial" w:hAnsi="Arial" w:cs="Arial"/>
           <w:lang w:val="pt-BR"/>
         </w:rPr>
-        <w:t>• Erros de conversão de data (</w:t>
+        <w:t>Erros de conversão de data (</w:t>
       </w:r>
       <w:proofErr w:type="spellStart"/>
       <w:r>
@@ -1914,6 +1825,11 @@
     <w:p>
       <w:pPr>
         <w:pStyle w:val="Numerada"/>
+        <w:numPr>
+          <w:ilvl w:val="0"/>
+          <w:numId w:val="0"/>
+        </w:numPr>
+        <w:ind w:left="360"/>
         <w:rPr>
           <w:rFonts w:ascii="Arial" w:hAnsi="Arial" w:cs="Arial"/>
           <w:lang w:val="pt-BR"/>
@@ -1930,6 +1846,11 @@
     <w:p>
       <w:pPr>
         <w:pStyle w:val="Numerada"/>
+        <w:numPr>
+          <w:ilvl w:val="0"/>
+          <w:numId w:val="0"/>
+        </w:numPr>
+        <w:ind w:left="360"/>
         <w:rPr>
           <w:rFonts w:ascii="Arial" w:hAnsi="Arial" w:cs="Arial"/>
           <w:lang w:val="pt-BR"/>
@@ -1962,6 +1883,11 @@
     <w:p>
       <w:pPr>
         <w:pStyle w:val="Numerada"/>
+        <w:numPr>
+          <w:ilvl w:val="0"/>
+          <w:numId w:val="0"/>
+        </w:numPr>
+        <w:ind w:left="360"/>
         <w:rPr>
           <w:rFonts w:ascii="Arial" w:hAnsi="Arial" w:cs="Arial"/>
           <w:lang w:val="pt-BR"/>
@@ -1986,7 +1912,7 @@
 </file>
 
 <file path=word/numbering.xml><?xml version="1.0" encoding="utf-8"?>
-<w:numbering xmlns:wpc="http://schemas.microsoft.com/office/word/2010/wordprocessingCanvas" xmlns:cx="http://schemas.microsoft.com/office/drawing/2014/chartex" xmlns:cx1="http://schemas.microsoft.com/office/drawing/2015/9/8/chartex" xmlns:cx2="http://schemas.microsoft.com/office/drawing/2015/10/21/chartex" xmlns:cx3="http://schemas.microsoft.com/office/drawing/2016/5/9/chartex" xmlns:cx4="http://schemas.microsoft.com/office/drawing/2016/5/10/chartex" xmlns:cx5="http://schemas.microsoft.com/office/drawing/2016/5/11/chartex" xmlns:cx6="http://schemas.microsoft.com/office/drawing/2016/5/12/chartex" xmlns:cx7="http://schemas.microsoft.com/office/drawing/2016/5/13/chartex" xmlns:cx8="http://schemas.microsoft.com/office/drawing/2016/5/14/chartex" xmlns:mc="http://schemas.openxmlformats.org/markup-compatibility/2006" xmlns:aink="http://schemas.microsoft.com/office/drawing/2016/ink" xmlns:am3d="http://schemas.microsoft.com/office/drawing/2017/model3d" xmlns:o="urn:schemas-microsoft-com:office:office" xmlns:r="http://schemas.openxmlformats.org/officeDocument/2006/relationships" xmlns:m="http://schemas.openxmlformats.org/officeDocument/2006/math" xmlns:v="urn:schemas-microsoft-com:vml" xmlns:wp14="http://schemas.microsoft.com/office/word/2010/wordprocessingDrawing" xmlns:wp="http://schemas.openxmlformats.org/drawingml/2006/wordprocessingDrawing" xmlns:w10="urn:schemas-microsoft-com:office:word" xmlns:w="http://schemas.openxmlformats.org/wordprocessingml/2006/main" xmlns:w14="http://schemas.microsoft.com/office/word/2010/wordml" xmlns:w15="http://schemas.microsoft.com/office/word/2012/wordml" xmlns:w16cex="http://schemas.microsoft.com/office/word/2018/wordml/cex" xmlns:w16cid="http://schemas.microsoft.com/office/word/2016/wordml/cid" xmlns:w16="http://schemas.microsoft.com/office/word/2018/wordml" xmlns:w16sdtdh="http://schemas.microsoft.com/office/word/2020/wordml/sdtdatahash" xmlns:w16se="http://schemas.microsoft.com/office/word/2015/wordml/symex" xmlns:wpg="http://schemas.microsoft.com/office/word/2010/wordprocessingGroup" xmlns:wpi="http://schemas.microsoft.com/office/word/2010/wordprocessingInk" xmlns:wne="http://schemas.microsoft.com/office/word/2006/wordml" xmlns:wps="http://schemas.microsoft.com/office/word/2010/wordprocessingShape" mc:Ignorable="w14 w15 w16se w16cid w16 w16cex w16sdtdh wp14">
+<w:numbering xmlns:wpc="http://schemas.microsoft.com/office/word/2010/wordprocessingCanvas" xmlns:cx="http://schemas.microsoft.com/office/drawing/2014/chartex" xmlns:cx1="http://schemas.microsoft.com/office/drawing/2015/9/8/chartex" xmlns:cx2="http://schemas.microsoft.com/office/drawing/2015/10/21/chartex" xmlns:cx3="http://schemas.microsoft.com/office/drawing/2016/5/9/chartex" xmlns:cx4="http://schemas.microsoft.com/office/drawing/2016/5/10/chartex" xmlns:cx5="http://schemas.microsoft.com/office/drawing/2016/5/11/chartex" xmlns:cx6="http://schemas.microsoft.com/office/drawing/2016/5/12/chartex" xmlns:cx7="http://schemas.microsoft.com/office/drawing/2016/5/13/chartex" xmlns:cx8="http://schemas.microsoft.com/office/drawing/2016/5/14/chartex" xmlns:mc="http://schemas.openxmlformats.org/markup-compatibility/2006" xmlns:aink="http://schemas.microsoft.com/office/drawing/2016/ink" xmlns:am3d="http://schemas.microsoft.com/office/drawing/2017/model3d" xmlns:o="urn:schemas-microsoft-com:office:office" xmlns:oel="http://schemas.microsoft.com/office/2019/extlst" xmlns:r="http://schemas.openxmlformats.org/officeDocument/2006/relationships" xmlns:m="http://schemas.openxmlformats.org/officeDocument/2006/math" xmlns:v="urn:schemas-microsoft-com:vml" xmlns:wp14="http://schemas.microsoft.com/office/word/2010/wordprocessingDrawing" xmlns:wp="http://schemas.openxmlformats.org/drawingml/2006/wordprocessingDrawing" xmlns:w10="urn:schemas-microsoft-com:office:word" xmlns:w="http://schemas.openxmlformats.org/wordprocessingml/2006/main" xmlns:w14="http://schemas.microsoft.com/office/word/2010/wordml" xmlns:w15="http://schemas.microsoft.com/office/word/2012/wordml" xmlns:w16cex="http://schemas.microsoft.com/office/word/2018/wordml/cex" xmlns:w16cid="http://schemas.microsoft.com/office/word/2016/wordml/cid" xmlns:w16="http://schemas.microsoft.com/office/word/2018/wordml" xmlns:w16du="http://schemas.microsoft.com/office/word/2023/wordml/word16du" xmlns:w16sdtdh="http://schemas.microsoft.com/office/word/2020/wordml/sdtdatahash" xmlns:w16sdtfl="http://schemas.microsoft.com/office/word/2024/wordml/sdtformatlock" xmlns:w16se="http://schemas.microsoft.com/office/word/2015/wordml/symex" xmlns:wpg="http://schemas.microsoft.com/office/word/2010/wordprocessingGroup" xmlns:wpi="http://schemas.microsoft.com/office/word/2010/wordprocessingInk" xmlns:wne="http://schemas.microsoft.com/office/word/2006/wordml" xmlns:wps="http://schemas.microsoft.com/office/word/2010/wordprocessingShape" mc:Ignorable="w14 w15 w16se w16cid w16 w16cex w16sdtdh w16sdtfl w16du wp14">
   <w:abstractNum w:abstractNumId="0" w15:restartNumberingAfterBreak="0">
     <w:nsid w:val="FFFFFF7C"/>
     <w:multiLevelType w:val="singleLevel"/>
@@ -2158,38 +2084,38 @@
       </w:rPr>
     </w:lvl>
   </w:abstractNum>
-  <w:num w:numId="1">
+  <w:num w:numId="1" w16cid:durableId="737246806">
     <w:abstractNumId w:val="8"/>
   </w:num>
-  <w:num w:numId="2">
+  <w:num w:numId="2" w16cid:durableId="1120761840">
     <w:abstractNumId w:val="6"/>
   </w:num>
-  <w:num w:numId="3">
+  <w:num w:numId="3" w16cid:durableId="164593184">
     <w:abstractNumId w:val="5"/>
   </w:num>
-  <w:num w:numId="4">
+  <w:num w:numId="4" w16cid:durableId="245967088">
     <w:abstractNumId w:val="4"/>
   </w:num>
-  <w:num w:numId="5">
+  <w:num w:numId="5" w16cid:durableId="306664515">
     <w:abstractNumId w:val="7"/>
   </w:num>
-  <w:num w:numId="6">
+  <w:num w:numId="6" w16cid:durableId="713623213">
     <w:abstractNumId w:val="3"/>
   </w:num>
-  <w:num w:numId="7">
+  <w:num w:numId="7" w16cid:durableId="1032999022">
     <w:abstractNumId w:val="2"/>
   </w:num>
-  <w:num w:numId="8">
+  <w:num w:numId="8" w16cid:durableId="1872573671">
     <w:abstractNumId w:val="1"/>
   </w:num>
-  <w:num w:numId="9">
+  <w:num w:numId="9" w16cid:durableId="383603459">
     <w:abstractNumId w:val="0"/>
   </w:num>
 </w:numbering>
 </file>
 
 <file path=word/styles.xml><?xml version="1.0" encoding="utf-8"?>
-<w:styles xmlns:mc="http://schemas.openxmlformats.org/markup-compatibility/2006" xmlns:r="http://schemas.openxmlformats.org/officeDocument/2006/relationships" xmlns:w="http://schemas.openxmlformats.org/wordprocessingml/2006/main" xmlns:w14="http://schemas.microsoft.com/office/word/2010/wordml" xmlns:w15="http://schemas.microsoft.com/office/word/2012/wordml" xmlns:w16cex="http://schemas.microsoft.com/office/word/2018/wordml/cex" xmlns:w16cid="http://schemas.microsoft.com/office/word/2016/wordml/cid" xmlns:w16="http://schemas.microsoft.com/office/word/2018/wordml" xmlns:w16sdtdh="http://schemas.microsoft.com/office/word/2020/wordml/sdtdatahash" xmlns:w16se="http://schemas.microsoft.com/office/word/2015/wordml/symex" mc:Ignorable="w14 w15 w16se w16cid w16 w16cex w16sdtdh">
+<w:styles xmlns:mc="http://schemas.openxmlformats.org/markup-compatibility/2006" xmlns:r="http://schemas.openxmlformats.org/officeDocument/2006/relationships" xmlns:w="http://schemas.openxmlformats.org/wordprocessingml/2006/main" xmlns:w14="http://schemas.microsoft.com/office/word/2010/wordml" xmlns:w15="http://schemas.microsoft.com/office/word/2012/wordml" xmlns:w16cex="http://schemas.microsoft.com/office/word/2018/wordml/cex" xmlns:w16cid="http://schemas.microsoft.com/office/word/2016/wordml/cid" xmlns:w16="http://schemas.microsoft.com/office/word/2018/wordml" xmlns:w16du="http://schemas.microsoft.com/office/word/2023/wordml/word16du" xmlns:w16sdtdh="http://schemas.microsoft.com/office/word/2020/wordml/sdtdatahash" xmlns:w16sdtfl="http://schemas.microsoft.com/office/word/2024/wordml/sdtformatlock" xmlns:w16se="http://schemas.microsoft.com/office/word/2015/wordml/symex" mc:Ignorable="w14 w15 w16se w16cid w16 w16cex w16sdtdh w16sdtfl w16du">
   <w:docDefaults>
     <w:rPrDefault>
       <w:rPr>
@@ -2473,11 +2399,6 @@
     <w:lsdException w:name="Book Title" w:uiPriority="33" w:qFormat="1"/>
     <w:lsdException w:name="Bibliography" w:semiHidden="1" w:uiPriority="37" w:unhideWhenUsed="1"/>
     <w:lsdException w:name="TOC Heading" w:semiHidden="1" w:uiPriority="39" w:unhideWhenUsed="1" w:qFormat="1"/>
-    <w:lsdException w:name="Plain Table 5" w:semiHidden="1" w:unhideWhenUsed="1"/>
-    <w:lsdException w:name="Grid Table Light" w:semiHidden="1" w:unhideWhenUsed="1"/>
-    <w:lsdException w:name="Grid Table 1 Light" w:semiHidden="1" w:unhideWhenUsed="1"/>
-    <w:lsdException w:name="Grid Table 2" w:semiHidden="1" w:unhideWhenUsed="1"/>
-    <w:lsdException w:name="Grid Table 3" w:semiHidden="1" w:unhideWhenUsed="1"/>
     <w:lsdException w:name="Grid Table 4" w:uiPriority="49"/>
     <w:lsdException w:name="Grid Table 5 Dark" w:uiPriority="50"/>
     <w:lsdException w:name="Grid Table 6 Colorful" w:uiPriority="51"/>

</xml_diff>